<commit_message>
Course 1.13: read LAPS expiry with the LAPS cmdlet from the Tier 2 seat
The AD module needs AD Web Services (TCP 9389), which course 1.8 opens only
to AdminJumpBox01, so Get-ADComputer inside SBD-ADMIN-PC01 would fail.
Get-LapsADPassword reads over LDAP and shows the expiry. The scale check's
directory counts are labelled as run from AdminJumpBox01.

Co-Authored-By: Claude Opus 5.5 <noreply@anthropic.com>
Claude-Session: https://claude.ai/code/session_018zdyUa6VFYrxc61jbbwg95
</commit_message>
<xml_diff>
--- a/public/training/workstation-fleet/SecureByDesign-workstation-fleet-Workbook.docx
+++ b/public/training/workstation-fleet/SecureByDesign-workstation-fleet-Workbook.docx
@@ -3285,7 +3285,7 @@
           <w:sz w:val="18"/>
           <w:szCs w:val="18"/>
         </w:rPr>
-        <w:t xml:space="preserve">Get-LapsADPassword -Identity SBD-PC01 -AsPlainText</w:t>
+        <w:t xml:space="preserve"># The LAPS cmdlets read the directory over LDAP; the AD module's web service (TCP 9389) is open only to AdminJumpBox01</w:t>
       </w:r>
     </w:p>
     <w:p>
@@ -3301,7 +3301,7 @@
           <w:sz w:val="18"/>
           <w:szCs w:val="18"/>
         </w:rPr>
-        <w:t xml:space="preserve">Get-ADComputer SBD-PC01 -Properties msLAPS-PasswordExpirationTime | Select-Object Name, msLAPS-PasswordExpirationTime</w:t>
+        <w:t xml:space="preserve">Get-LapsADPassword -Identity SBD-PC01 -AsPlainText | Select-Object ComputerName, Account, ExpirationTimestamp</w:t>
       </w:r>
     </w:p>
     <w:p>
@@ -6281,6 +6281,22 @@
           <w:szCs w:val="26"/>
         </w:rPr>
         <w:t xml:space="preserve">Check your result</w:t>
+      </w:r>
+    </w:p>
+    <w:p>
+      <w:pPr>
+        <w:shd w:fill="F1F7FA" w:color="auto" w:val="clear"/>
+        <w:spacing w:after="0" w:before="0" w:line="252" w:lineRule="auto"/>
+        <w:ind w:left="160" w:right="160"/>
+      </w:pPr>
+      <w:r>
+        <w:rPr>
+          <w:rFonts w:ascii="Consolas" w:cs="Consolas" w:eastAsia="Consolas" w:hAnsi="Consolas"/>
+          <w:color w:val="193448"/>
+          <w:sz w:val="18"/>
+          <w:szCs w:val="18"/>
+        </w:rPr>
+        <w:t xml:space="preserve"># On AdminJumpBox01 (Tier 0): the fleet's computer objects and its group</w:t>
       </w:r>
     </w:p>
     <w:p>

</xml_diff>

<commit_message>
Success texts describe what the consoles show
Owner direction, 22 October 2026. The 22 "What success looks like" texts that named command output now
describe what the consoles show (Sites and Services, DNS Manager, Group Policy Management, the DHCP console,
Enterprise PKI, Event Viewer and others). Items that stay commands (w32tm for the time service, DCDiag, the SMB
signing state) are named as the command-line route. Guides, workbooks and app content follow.
</commit_message>
<xml_diff>
--- a/public/training/workstation-fleet/SecureByDesign-workstation-fleet-Workbook.docx
+++ b/public/training/workstation-fleet/SecureByDesign-workstation-fleet-Workbook.docx
@@ -3779,7 +3779,7 @@
           <w:sz w:val="20"/>
           <w:szCs w:val="20"/>
         </w:rPr>
-        <w:t xml:space="preserve">The schema holds the LAPS attributes, only SBD Tier 2 Admins (beside the default Domain Admins) can read and decrypt passwords, the policy shows on the pilots, and one retrieve-use-rotate cycle is recorded.</w:t>
+        <w:t xml:space="preserve">The LAPS tab appears on each pilot in Active Directory Users and Computers, showing the managed account, password and expiration only to SBD Tier 2 Admins (beside the default Domain Admins); Group Policy Results shows the LAPS policy applied on the pilots; and one retrieve-use-rotate cycle is recorded.</w:t>
       </w:r>
     </w:p>
     <w:p>
@@ -4923,7 +4923,7 @@
           <w:sz w:val="20"/>
           <w:szCs w:val="20"/>
         </w:rPr>
-        <w:t xml:space="preserve">Pilot endpoints enroll hands-free once they are in SBD Fleet Computers, verification passes with live publication retrieval and nothing cached, and the CA's issued log shows their SBD Computer Authentication certificates.</w:t>
+        <w:t xml:space="preserve">The pilots enroll hands-free once Active Directory Users and Computers shows them in SBD Fleet Computers; Certificates (Local Computer) on each shows its SBD Computer Authentication certificate with a Certification Path that reads OK, with live publication retrieval and nothing cached; and the CA's Issued Certificates lists them.</w:t>
       </w:r>
     </w:p>
     <w:p>

</xml_diff>